<commit_message>
feat: endorse letter goes macroized — college_name in application letter + endorsement
The application letter red text (College of Arts and Sciences) becomes the
${college_name} variable. The Endorsement Letter — whose variables the
user hand-typed — is corrected (the letter addresses the intern via
${intern_name}, not the course name), gains ${college_name} and the
signing ${coordinator_name}, moves to templates/, and is now macroized
(autofill) so interns receive it filled per intern. Blank-copy coverage
moves to the Acceptance Form. 331 tests passing.
</commit_message>
<xml_diff>
--- a/public/documents/templates/application-letter-template.docx
+++ b/public/documents/templates/application-letter-template.docx
@@ -50,10 +50,10 @@
         <w:rPr>
           <w:rFonts w:ascii="Arial" w:hAnsi="Arial" w:cs="Arial"/>
           <w:b/>
-          <w:sz w:val="24"/>
           <w:caps/>
-        </w:rPr>
-        <w:t xml:space="preserve">${addressee_name}</w:t>
+          <w:sz w:val="24"/>
+        </w:rPr>
+        <w:t>${addressee_name}</w:t>
       </w:r>
     </w:p>
     <w:p>
@@ -70,7 +70,7 @@
           <w:rFonts w:ascii="Arial" w:hAnsi="Arial" w:cs="Arial"/>
           <w:sz w:val="24"/>
         </w:rPr>
-        <w:t xml:space="preserve">${addressee_position}</w:t>
+        <w:t>${addressee_position}</w:t>
       </w:r>
     </w:p>
     <w:p>
@@ -87,7 +87,7 @@
           <w:rFonts w:ascii="Arial" w:hAnsi="Arial" w:cs="Arial"/>
           <w:sz w:val="24"/>
         </w:rPr>
-        <w:t xml:space="preserve">${company_name}</w:t>
+        <w:t>${company_name}</w:t>
       </w:r>
     </w:p>
     <w:p>
@@ -104,41 +104,41 @@
           <w:rFonts w:ascii="Arial" w:hAnsi="Arial" w:cs="Arial"/>
           <w:sz w:val="24"/>
         </w:rPr>
-        <w:t xml:space="preserve">${company_address}</w:t>
-      </w:r>
-    </w:p>
-    <w:p>
-      <w:pPr>
-        <w:spacing w:after="0" w:line="240" w:lineRule="auto"/>
-        <w:rPr>
-          <w:rFonts w:ascii="Arial" w:hAnsi="Arial" w:cs="Arial"/>
-          <w:sz w:val="24"/>
-        </w:rPr>
-      </w:pPr>
-    </w:p>
-    <w:p>
-      <w:pPr>
-        <w:spacing w:after="0" w:line="240" w:lineRule="auto"/>
-        <w:rPr>
-          <w:rFonts w:ascii="Arial" w:hAnsi="Arial" w:cs="Arial"/>
-          <w:sz w:val="24"/>
-        </w:rPr>
-      </w:pPr>
-    </w:p>
-    <w:p>
-      <w:pPr>
-        <w:spacing w:after="0" w:line="240" w:lineRule="auto"/>
-        <w:rPr>
-          <w:rFonts w:ascii="Arial" w:hAnsi="Arial" w:cs="Arial"/>
-          <w:sz w:val="24"/>
-        </w:rPr>
-      </w:pPr>
-      <w:r>
-        <w:rPr>
-          <w:rFonts w:ascii="Arial" w:hAnsi="Arial" w:cs="Arial"/>
-          <w:sz w:val="24"/>
-        </w:rPr>
-        <w:t xml:space="preserve">${salutation}</w:t>
+        <w:t>${company_address}</w:t>
+      </w:r>
+    </w:p>
+    <w:p>
+      <w:pPr>
+        <w:spacing w:after="0" w:line="240" w:lineRule="auto"/>
+        <w:rPr>
+          <w:rFonts w:ascii="Arial" w:hAnsi="Arial" w:cs="Arial"/>
+          <w:sz w:val="24"/>
+        </w:rPr>
+      </w:pPr>
+    </w:p>
+    <w:p>
+      <w:pPr>
+        <w:spacing w:after="0" w:line="240" w:lineRule="auto"/>
+        <w:rPr>
+          <w:rFonts w:ascii="Arial" w:hAnsi="Arial" w:cs="Arial"/>
+          <w:sz w:val="24"/>
+        </w:rPr>
+      </w:pPr>
+    </w:p>
+    <w:p>
+      <w:pPr>
+        <w:spacing w:after="0" w:line="240" w:lineRule="auto"/>
+        <w:rPr>
+          <w:rFonts w:ascii="Arial" w:hAnsi="Arial" w:cs="Arial"/>
+          <w:sz w:val="24"/>
+        </w:rPr>
+      </w:pPr>
+      <w:r>
+        <w:rPr>
+          <w:rFonts w:ascii="Arial" w:hAnsi="Arial" w:cs="Arial"/>
+          <w:sz w:val="24"/>
+        </w:rPr>
+        <w:t>${salutation}</w:t>
       </w:r>
       <w:r>
         <w:rPr>
@@ -171,14 +171,7 @@
           <w:rFonts w:ascii="Arial" w:hAnsi="Arial" w:cs="Arial"/>
           <w:sz w:val="24"/>
         </w:rPr>
-        <w:t xml:space="preserve">The knowledge and skills I acquired during my three years of rigorous study as </w:t>
-      </w:r>
-      <w:r>
-        <w:rPr>
-          <w:rFonts w:ascii="Arial" w:hAnsi="Arial" w:cs="Arial"/>
-          <w:sz w:val="24"/>
-        </w:rPr>
-        <w:t xml:space="preserve">a </w:t>
+        <w:t xml:space="preserve">The knowledge and skills I acquired during my three years of rigorous study as a </w:t>
       </w:r>
       <w:r>
         <w:rPr>
@@ -186,21 +179,14 @@
           <w:b/>
           <w:sz w:val="24"/>
         </w:rPr>
-        <w:t xml:space="preserve">${course_name}</w:t>
-      </w:r>
-      <w:r>
-        <w:rPr>
-          <w:rFonts w:ascii="Arial" w:hAnsi="Arial" w:cs="Arial"/>
-          <w:sz w:val="24"/>
-        </w:rPr>
-        <w:t xml:space="preserve"> </w:t>
-      </w:r>
-      <w:r>
-        <w:rPr>
-          <w:rFonts w:ascii="Arial" w:hAnsi="Arial" w:cs="Arial"/>
-          <w:sz w:val="24"/>
-        </w:rPr>
-        <w:t xml:space="preserve">student </w:t>
+        <w:t>${course_name}</w:t>
+      </w:r>
+      <w:r>
+        <w:rPr>
+          <w:rFonts w:ascii="Arial" w:hAnsi="Arial" w:cs="Arial"/>
+          <w:sz w:val="24"/>
+        </w:rPr>
+        <w:t xml:space="preserve"> student </w:t>
       </w:r>
       <w:r>
         <w:rPr>
@@ -212,9 +198,10 @@
       <w:r>
         <w:rPr>
           <w:rFonts w:ascii="Arial" w:hAnsi="Arial" w:cs="Arial"/>
-          <w:sz w:val="24"/>
-        </w:rPr>
-        <w:t xml:space="preserve">College of Arts &amp; Sciences </w:t>
+          <w:color w:val="FF0000"/>
+          <w:sz w:val="24"/>
+        </w:rPr>
+        <w:t xml:space="preserve">${college_name} </w:t>
       </w:r>
       <w:r>
         <w:rPr>
@@ -242,21 +229,7 @@
           <w:rFonts w:ascii="Arial" w:hAnsi="Arial" w:cs="Arial"/>
           <w:sz w:val="24"/>
         </w:rPr>
-        <w:t xml:space="preserve">sity </w:t>
-      </w:r>
-      <w:r>
-        <w:rPr>
-          <w:rFonts w:ascii="Arial" w:hAnsi="Arial" w:cs="Arial"/>
-          <w:sz w:val="24"/>
-        </w:rPr>
-        <w:t>Bayawan</w:t>
-      </w:r>
-      <w:r>
-        <w:rPr>
-          <w:rFonts w:ascii="Arial" w:hAnsi="Arial" w:cs="Arial"/>
-          <w:sz w:val="24"/>
-        </w:rPr>
-        <w:t xml:space="preserve"> – Sta. Catalina Campus has equipped me with the necessary things that make me ready to be exposed to the industry.</w:t>
+        <w:t>sity Bayawan – Sta. Catalina Campus has equipped me with the necessary things that make me ready to be exposed to the industry.</w:t>
       </w:r>
     </w:p>
     <w:p>
@@ -296,7 +269,7 @@
           <w:rFonts w:ascii="Arial" w:hAnsi="Arial" w:cs="Arial"/>
           <w:sz w:val="24"/>
         </w:rPr>
-        <w:t xml:space="preserve">${ojt_period_start} until I complete my required ${target_hours} training hours</w:t>
+        <w:t>${ojt_period_start} until I complete my required ${target_hours} training hours</w:t>
       </w:r>
       <w:r>
         <w:rPr>
@@ -834,21 +807,7 @@
           <w:rFonts w:ascii="Arial" w:hAnsi="Arial" w:cs="Arial"/>
           <w:sz w:val="24"/>
         </w:rPr>
-        <w:t xml:space="preserve">I am willing to come to your office for an interview at your most convenient time. I can be reached through this mobile number </w:t>
-      </w:r>
-      <w:r>
-        <w:rPr>
-          <w:rFonts w:ascii="Arial" w:hAnsi="Arial" w:cs="Arial"/>
-          <w:sz w:val="24"/>
-        </w:rPr>
-        <w:t xml:space="preserve">${contact_number}</w:t>
-      </w:r>
-      <w:r>
-        <w:rPr>
-          <w:rFonts w:ascii="Arial" w:hAnsi="Arial" w:cs="Arial"/>
-          <w:sz w:val="24"/>
-        </w:rPr>
-        <w:t>.</w:t>
+        <w:t>I am willing to come to your office for an interview at your most convenient time. I can be reached through this mobile number ${contact_number}.</w:t>
       </w:r>
     </w:p>
     <w:p>
@@ -991,10 +950,10 @@
         <w:rPr>
           <w:rFonts w:ascii="Arial" w:hAnsi="Arial" w:cs="Arial"/>
           <w:b/>
-          <w:sz w:val="24"/>
           <w:caps/>
-        </w:rPr>
-        <w:t xml:space="preserve">${intern_name}</w:t>
+          <w:sz w:val="24"/>
+        </w:rPr>
+        <w:t>${intern_name}</w:t>
       </w:r>
     </w:p>
     <w:p>

</xml_diff>